<commit_message>
Add e-Daakhil form filling sheet; note policy renewal in complaint
- New para 16-A: insurer itself renewed the policy (ASHP202400001607R1,
  04.11.2025-03.11.2026, SI Rs 11L) recording first inception 04.11.2024
- Annexure C-1 made collective to include renewal schedule
- Field-by-field e-Daakhil sheet with ready-to-paste gist, relief text,
  affidavit and memo of parties drafts, renewal verification table

Co-Authored-By: Claude Fable 5 <noreply@anthropic.com>
Claude-Session: https://claude.ai/code/session_01PvWKpJ311CVHomte8xk3CL
</commit_message>
<xml_diff>
--- a/CASE/Consumer_Complaint_Draft_DCDRC_Ghaziabad.docx
+++ b/CASE/Consumer_Complaint_Draft_DCDRC_Ghaziabad.docx
@@ -2488,6 +2488,57 @@
     </w:p>
     <w:p>
       <w:pPr>
+        <w:spacing w:line="360" w:lineRule="auto"/>
+        <w:jc w:val="both"/>
+      </w:pPr>
+      <w:r>
+        <w:rPr>
+          <w:rFonts w:ascii="Times New Roman" w:hAnsi="Times New Roman" w:cs="Nirmala UI" w:eastAsia="Times New Roman"/>
+          <w:b w:val="0"/>
+          <w:i w:val="0"/>
+          <w:sz w:val="24"/>
+        </w:rPr>
+        <w:t xml:space="preserve">16-A. Indeed, the Opposite Party has itself </w:t>
+      </w:r>
+      <w:r>
+        <w:rPr>
+          <w:rFonts w:ascii="Times New Roman" w:hAnsi="Times New Roman" w:cs="Nirmala UI" w:eastAsia="Times New Roman"/>
+          <w:b/>
+          <w:i w:val="0"/>
+          <w:sz w:val="24"/>
+        </w:rPr>
+        <w:t>renewed</w:t>
+      </w:r>
+      <w:r>
+        <w:rPr>
+          <w:rFonts w:ascii="Times New Roman" w:hAnsi="Times New Roman" w:cs="Nirmala UI" w:eastAsia="Times New Roman"/>
+          <w:b w:val="0"/>
+          <w:i w:val="0"/>
+          <w:sz w:val="24"/>
+        </w:rPr>
+        <w:t xml:space="preserve"> the policy as Policy No. ASHP202400001607R1 for the period 04.11.2025–03.11.2026 (Sum Insured ₹11,00,000 including inflation-protection bonus; premium ₹36,656.86 — Annexure C-1 colly.). The renewal document records "</w:t>
+      </w:r>
+      <w:r>
+        <w:rPr>
+          <w:rFonts w:ascii="Times New Roman" w:hAnsi="Times New Roman" w:cs="Nirmala UI" w:eastAsia="Times New Roman"/>
+          <w:b/>
+          <w:i w:val="0"/>
+          <w:sz w:val="24"/>
+        </w:rPr>
+        <w:t>First policy inception date: 04/11/2024</w:t>
+      </w:r>
+      <w:r>
+        <w:rPr>
+          <w:rFonts w:ascii="Times New Roman" w:hAnsi="Times New Roman" w:cs="Nirmala UI" w:eastAsia="Times New Roman"/>
+          <w:b w:val="0"/>
+          <w:i w:val="0"/>
+          <w:sz w:val="24"/>
+        </w:rPr>
+        <w:t>" and "Existing user: Yes". The insurer thus continues to accept the Complainant's premium and treats the cover as continuous from 04.11.2024 — even while refusing the only claim ever made under it.</w:t>
+      </w:r>
+    </w:p>
+    <w:p>
+      <w:pPr>
         <w:spacing w:before="240"/>
         <w:jc w:val="center"/>
       </w:pPr>
@@ -4322,7 +4373,7 @@
                 <w:i w:val="0"/>
                 <w:sz w:val="20"/>
               </w:rPr>
-              <w:t>C-1</w:t>
+              <w:t>C-1 (colly.)</w:t>
             </w:r>
           </w:p>
         </w:tc>
@@ -4339,7 +4390,7 @@
                 <w:i w:val="0"/>
                 <w:sz w:val="20"/>
               </w:rPr>
-              <w:t>Policy Schedule, Policy No. ASHP202400001607 (with "Additional conditions" and Annexure – Specific illness list)</w:t>
+              <w:t>Policy Schedule, Policy No. ASHP202400001607 (with "Additional conditions" and Annexure – Specific illness list); renewal Policy Schedule No. ASHP202400001607R1 (04.11.2025–03.11.2026)</w:t>
             </w:r>
           </w:p>
         </w:tc>

</xml_diff>

<commit_message>
Record NCH/INGRAM grievance no. 9719631 (14.07.2026)
- Save grievance details PDF under CASE/NCH_INGRAM_Grievance_9719631/
- Add Case_Status_Tracker.md with full forum-wise timeline and next
  actions
- Add NCH grievance row to complaint chronology

Co-Authored-By: Claude Fable 5 <noreply@anthropic.com>
Claude-Session: https://claude.ai/code/session_01PvWKpJ311CVHomte8xk3CL
</commit_message>
<xml_diff>
--- a/CASE/Consumer_Complaint_Draft_DCDRC_Ghaziabad.docx
+++ b/CASE/Consumer_Complaint_Draft_DCDRC_Ghaziabad.docx
@@ -1397,6 +1397,59 @@
                 <w:sz w:val="20"/>
               </w:rPr>
               <w:t>Annexure C-12</w:t>
+            </w:r>
+          </w:p>
+        </w:tc>
+      </w:tr>
+      <w:tr>
+        <w:tc>
+          <w:tcPr>
+            <w:tcW w:type="dxa" w:w="3000"/>
+          </w:tcPr>
+          <w:p>
+            <w:r/>
+            <w:r>
+              <w:rPr>
+                <w:rFonts w:ascii="Times New Roman" w:hAnsi="Times New Roman" w:cs="Nirmala UI" w:eastAsia="Times New Roman"/>
+                <w:b w:val="0"/>
+                <w:i w:val="0"/>
+                <w:sz w:val="20"/>
+              </w:rPr>
+              <w:t>14.07.2026</w:t>
+            </w:r>
+          </w:p>
+        </w:tc>
+        <w:tc>
+          <w:tcPr>
+            <w:tcW w:type="dxa" w:w="3000"/>
+          </w:tcPr>
+          <w:p>
+            <w:r/>
+            <w:r>
+              <w:rPr>
+                <w:rFonts w:ascii="Times New Roman" w:hAnsi="Times New Roman" w:cs="Nirmala UI" w:eastAsia="Times New Roman"/>
+                <w:b w:val="0"/>
+                <w:i w:val="0"/>
+                <w:sz w:val="20"/>
+              </w:rPr>
+              <w:t>Grievance registered on the National Consumer Helpline (INGRAM) portal against the repudiation — Grievance No. 9719631 (status: in process)</w:t>
+            </w:r>
+          </w:p>
+        </w:tc>
+        <w:tc>
+          <w:tcPr>
+            <w:tcW w:type="dxa" w:w="3000"/>
+          </w:tcPr>
+          <w:p>
+            <w:r/>
+            <w:r>
+              <w:rPr>
+                <w:rFonts w:ascii="Times New Roman" w:hAnsi="Times New Roman" w:cs="Nirmala UI" w:eastAsia="Times New Roman"/>
+                <w:b w:val="0"/>
+                <w:i w:val="0"/>
+                <w:sz w:val="20"/>
+              </w:rPr>
+              <w:t>Annexure C-10 (colly.)</w:t>
             </w:r>
           </w:p>
         </w:tc>

</xml_diff>

<commit_message>
Record ACKO GRO reply of 15.07.2026 reiterating waiting-period rejection
- Save GRO email (Abdul Nayeem, grievance@acko.com) in NCH grievance folder
  and in annexure C-10F email thread (folder + assembled zip)
- Add 15.07.2026 row to Case Status Tracker and complaint chronology
  (md + docx): same verbatim ground as 26.06.2025, no listed condition
  identified, new evidence and Ombudsman paras 13-14 not addressed

Co-Authored-By: Claude Fable 5 <noreply@anthropic.com>
Claude-Session: https://claude.ai/code/session_017Q26VcpuyV3Jk1K7rRZfTL
</commit_message>
<xml_diff>
--- a/CASE/Consumer_Complaint_Draft_DCDRC_Ghaziabad.docx
+++ b/CASE/Consumer_Complaint_Draft_DCDRC_Ghaziabad.docx
@@ -1449,6 +1449,38 @@
                 <w:i w:val="0"/>
                 <w:sz w:val="20"/>
               </w:rPr>
+              <w:t>Annexure C-10 (colly.)</w:t>
+            </w:r>
+          </w:p>
+        </w:tc>
+      </w:tr>
+      <w:tr>
+        <w:tc>
+          <w:tcPr>
+            <w:tcW w:type="dxa" w:w="3000"/>
+          </w:tcPr>
+          <w:p>
+            <w:r>
+              <w:t>15.07.2026</w:t>
+            </w:r>
+          </w:p>
+        </w:tc>
+        <w:tc>
+          <w:tcPr>
+            <w:tcW w:type="dxa" w:w="3000"/>
+          </w:tcPr>
+          <w:p>
+            <w:r>
+              <w:t>Opposite Party's Grievance Redressal Officer replies by email, reiterating verbatim the very “waiting period” ground of 26.06.2025 — once again without identifying any listed condition in the Schedule, and without adverting to the biopsy report, the treating doctor's certificate dated 12.07.2026, or the Ombudsman's findings in paras 13–14 of the Award</w:t>
+            </w:r>
+          </w:p>
+        </w:tc>
+        <w:tc>
+          <w:tcPr>
+            <w:tcW w:type="dxa" w:w="3000"/>
+          </w:tcPr>
+          <w:p>
+            <w:r>
               <w:t>Annexure C-10 (colly.)</w:t>
             </w:r>
           </w:p>

</xml_diff>

<commit_message>
Fill father's name (Shri Surendra Gandhi) across filing documents; memorize in CLAUDE.md
Filled the S/o blanks in the Proforma, Memo of Parties, Affidavit and
Vakalatnama; added the father's name to the complaint party description
(md + docx) and the e-Daakhil form sheet; rebuilt the e-Jagriti package
zip; recorded the detail in CLAUDE.md for future sessions.

Co-Authored-By: Claude Fable 5 <noreply@anthropic.com>
Claude-Session: https://claude.ai/code/session_01B93ackmngRBf2d9NWTvMia
</commit_message>
<xml_diff>
--- a/CASE/Consumer_Complaint_Draft_DCDRC_Ghaziabad.docx
+++ b/CASE/Consumer_Complaint_Draft_DCDRC_Ghaziabad.docx
@@ -88,7 +88,7 @@
           <w:i w:val="0"/>
           <w:sz w:val="24"/>
         </w:rPr>
-        <w:t>Aged about 53 years,</w:t>
+        <w:t>S/o Shri Surendra Gandhi, aged about 53 years,</w:t>
       </w:r>
     </w:p>
     <w:p>
@@ -1723,25 +1723,7 @@
           <w:i/>
           <w:sz w:val="22"/>
         </w:rPr>
-        <w:t xml:space="preserve">"Externally shows </w:t>
-      </w:r>
-      <w:r>
-        <w:rPr>
-          <w:rFonts w:ascii="Times New Roman" w:hAnsi="Times New Roman" w:cs="Nirmala UI" w:eastAsia="Times New Roman"/>
-          <w:b w:val="0"/>
-          <w:i/>
-          <w:sz w:val="22"/>
-        </w:rPr>
-        <w:t>cauliflower like lesion</w:t>
-      </w:r>
-      <w:r>
-        <w:rPr>
-          <w:rFonts w:ascii="Times New Roman" w:hAnsi="Times New Roman" w:cs="Nirmala UI" w:eastAsia="Times New Roman"/>
-          <w:b w:val="0"/>
-          <w:i/>
-          <w:sz w:val="22"/>
-        </w:rPr>
-        <w:t xml:space="preserve"> measures 3.5 x 3 x 0.8 cm."</w:t>
+        <w:t xml:space="preserve">"Externally shows cauliflower like lesion measures 3.5 x 3 x 0.8 cm."</w:t>
       </w:r>
     </w:p>
     <w:p>
@@ -2009,43 +1991,7 @@
           <w:i/>
           <w:sz w:val="22"/>
         </w:rPr>
-        <w:t xml:space="preserve">"Mr. Vikas Gandhi, 54 yrs Male, R/o D-20, Dayanand Nagar, Ghaziabad </w:t>
-      </w:r>
-      <w:r>
-        <w:rPr>
-          <w:rFonts w:ascii="Times New Roman" w:hAnsi="Times New Roman" w:cs="Nirmala UI" w:eastAsia="Times New Roman"/>
-          <w:b w:val="0"/>
-          <w:i/>
-          <w:sz w:val="22"/>
-        </w:rPr>
-        <w:t>was suffering from Phimosis with Balanitis with meatal stenosis &amp; UTI. His surgery was must in view of unable to pass urine &amp; UTI. His Preputial Biopsy came out to be (BXO) which is a pre-malignant condition</w:t>
-      </w:r>
-      <w:r>
-        <w:rPr>
-          <w:rFonts w:ascii="Times New Roman" w:hAnsi="Times New Roman" w:cs="Nirmala UI" w:eastAsia="Times New Roman"/>
-          <w:b w:val="0"/>
-          <w:i/>
-          <w:sz w:val="22"/>
-        </w:rPr>
-        <w:t xml:space="preserve"> &amp; not any elective or cosmetic surgery. </w:t>
-      </w:r>
-      <w:r>
-        <w:rPr>
-          <w:rFonts w:ascii="Times New Roman" w:hAnsi="Times New Roman" w:cs="Nirmala UI" w:eastAsia="Times New Roman"/>
-          <w:b w:val="0"/>
-          <w:i/>
-          <w:sz w:val="22"/>
-        </w:rPr>
-        <w:t>There is life threatening infection risk &amp; risk of penile cancer if not treated…</w:t>
-      </w:r>
-      <w:r>
-        <w:rPr>
-          <w:rFonts w:ascii="Times New Roman" w:hAnsi="Times New Roman" w:cs="Nirmala UI" w:eastAsia="Times New Roman"/>
-          <w:b w:val="0"/>
-          <w:i/>
-          <w:sz w:val="22"/>
-        </w:rPr>
-        <w:t>"</w:t>
+        <w:t xml:space="preserve">"Mr. Vikas Gandhi, 54 yrs Male, R/o D-20, Dayanand Nagar, Ghaziabad was suffering from Phimosis with Balanitis with meatal stenosis &amp; UTI. His surgery was must in view of unable to pass urine &amp; UTI. His Preputial Biopsy came out to be (BXO) which is a pre-malignant condition &amp; not any elective or cosmetic surgery. There is life threatening infection risk &amp; risk of penile cancer if not treated…"</w:t>
       </w:r>
     </w:p>
     <w:p>
@@ -3350,25 +3296,7 @@
           <w:i/>
           <w:sz w:val="22"/>
         </w:rPr>
-        <w:t xml:space="preserve">"It is noted that </w:t>
-      </w:r>
-      <w:r>
-        <w:rPr>
-          <w:rFonts w:ascii="Times New Roman" w:hAnsi="Times New Roman" w:cs="Nirmala UI" w:eastAsia="Times New Roman"/>
-          <w:b w:val="0"/>
-          <w:i/>
-          <w:sz w:val="22"/>
-        </w:rPr>
-        <w:t>it is not disputed that the procedure was medically necessary</w:t>
-      </w:r>
-      <w:r>
-        <w:rPr>
-          <w:rFonts w:ascii="Times New Roman" w:hAnsi="Times New Roman" w:cs="Nirmala UI" w:eastAsia="Times New Roman"/>
-          <w:b w:val="0"/>
-          <w:i/>
-          <w:sz w:val="22"/>
-        </w:rPr>
-        <w:t xml:space="preserve"> and it was undertaken to address the complaint/problem of poor flow of urine, and it has also been conveyed by complainant that he had serious infection."</w:t>
+        <w:t xml:space="preserve">"It is noted that it is not disputed that the procedure was medically necessary and it was undertaken to address the complaint/problem of poor flow of urine, and it has also been conveyed by complainant that he had serious infection."</w:t>
       </w:r>
     </w:p>
     <w:p>
@@ -3405,25 +3333,7 @@
           <w:i/>
           <w:sz w:val="22"/>
         </w:rPr>
-        <w:t xml:space="preserve">"In this sense, the procedure involving circumcision + meatoplasty </w:t>
-      </w:r>
-      <w:r>
-        <w:rPr>
-          <w:rFonts w:ascii="Times New Roman" w:hAnsi="Times New Roman" w:cs="Nirmala UI" w:eastAsia="Times New Roman"/>
-          <w:b w:val="0"/>
-          <w:i/>
-          <w:sz w:val="22"/>
-        </w:rPr>
-        <w:t>would not be covered under the Permanent Exclusion clause 4.2.3</w:t>
-      </w:r>
-      <w:r>
-        <w:rPr>
-          <w:rFonts w:ascii="Times New Roman" w:hAnsi="Times New Roman" w:cs="Nirmala UI" w:eastAsia="Times New Roman"/>
-          <w:b w:val="0"/>
-          <w:i/>
-          <w:sz w:val="22"/>
-        </w:rPr>
-        <w:t xml:space="preserve"> of the policy as it has been necessitated by illness and forming part of treatment."</w:t>
+        <w:t xml:space="preserve">"In this sense, the procedure involving circumcision + meatoplasty would not be covered under the Permanent Exclusion clause 4.2.3 of the policy as it has been necessitated by illness and forming part of treatment."</w:t>
       </w:r>
     </w:p>
     <w:p>

</xml_diff>